<commit_message>
docs(portfolio): rebrand assistant integration as Onesa AI
</commit_message>
<xml_diff>
--- a/client/public/docs/smartfactoryiot/api-flows.docx
+++ b/client/public/docs/smartfactoryiot/api-flows.docx
@@ -16,7 +16,7 @@
         <w:pStyle w:val="FirstParagraph"/>
       </w:pPr>
       <w:r>
-        <w:t xml:space="preserve">The React client calls the Node/Express tRPC API. Server-side procedures enforce the user’s current database role; client-side route and button checks only control presentation.</w:t>
+        <w:t xml:space="preserve">The React client calls the Node/Express tRPC API. Server-side procedures enforce the user's current database role; client-side route and button checks only control presentation.</w:t>
       </w:r>
     </w:p>
     <w:bookmarkStart w:id="9" w:name="login-and-authorization"/>
@@ -360,7 +360,7 @@
       </w:r>
     </w:p>
     <w:bookmarkEnd w:id="11"/>
-    <w:bookmarkStart w:id="12" w:name="import-package-.aasx"/>
+    <w:bookmarkStart w:id="12" w:name="import-package-aasx"/>
     <w:p>
       <w:pPr>
         <w:pStyle w:val="Heading3"/>
@@ -504,7 +504,7 @@
         <w:pStyle w:val="FirstParagraph"/>
       </w:pPr>
       <w:r>
-        <w:t xml:space="preserve">The UI’s</w:t>
+        <w:t xml:space="preserve">The UI's</w:t>
       </w:r>
       <w:r>
         <w:t xml:space="preserve"> </w:t>
@@ -609,13 +609,13 @@
       </w:r>
     </w:p>
     <w:bookmarkEnd w:id="13"/>
-    <w:bookmarkStart w:id="15" w:name="assistant-context-and-provider-routing"/>
+    <w:bookmarkStart w:id="15" w:name="assistant-context-and-onesa-ai-routing"/>
     <w:p>
       <w:pPr>
         <w:pStyle w:val="Heading3"/>
       </w:pPr>
       <w:r>
-        <w:t xml:space="preserve">Assistant context and provider routing</w:t>
+        <w:t xml:space="preserve">Assistant context and Onesa AI routing</w:t>
       </w:r>
     </w:p>
     <w:p>
@@ -680,52 +680,34 @@
         <w:rPr>
           <w:rStyle w:val="VerbatimChar"/>
         </w:rPr>
-        <w:t xml:space="preserve">  EVIDENCE --&gt;|Gemini key configured| GEMINI["Gemini primary model"]</w:t>
-      </w:r>
-      <w:r>
-        <w:br/>
-      </w:r>
-      <w:r>
-        <w:rPr>
-          <w:rStyle w:val="VerbatimChar"/>
-        </w:rPr>
-        <w:t xml:space="preserve">  EVIDENCE --&gt;|Remote providers disabled| LOCAL["Local grounded response"]</w:t>
-      </w:r>
-      <w:r>
-        <w:br/>
-      </w:r>
-      <w:r>
-        <w:rPr>
-          <w:rStyle w:val="VerbatimChar"/>
-        </w:rPr>
-        <w:t xml:space="preserve">  GEMINI --&gt;|Success| ANSWER["Direct answer with steps, time, and sources"]</w:t>
-      </w:r>
-      <w:r>
-        <w:br/>
-      </w:r>
-      <w:r>
-        <w:rPr>
-          <w:rStyle w:val="VerbatimChar"/>
-        </w:rPr>
-        <w:t xml:space="preserve">  GEMINI --&gt;|Missing key or provider error| GROQ["Groq fallback model"]</w:t>
-      </w:r>
-      <w:r>
-        <w:br/>
-      </w:r>
-      <w:r>
-        <w:rPr>
-          <w:rStyle w:val="VerbatimChar"/>
-        </w:rPr>
-        <w:t xml:space="preserve">  GROQ --&gt;|Success| ANSWER</w:t>
-      </w:r>
-      <w:r>
-        <w:br/>
-      </w:r>
-      <w:r>
-        <w:rPr>
-          <w:rStyle w:val="VerbatimChar"/>
-        </w:rPr>
-        <w:t xml:space="preserve">  GROQ --&gt;|No provider succeeds| LOCAL</w:t>
+        <w:t xml:space="preserve">  EVIDENCE --&gt;|Onesa AI configured| ONESA["Onesa AI — in-house, Llama-based"]</w:t>
+      </w:r>
+      <w:r>
+        <w:br/>
+      </w:r>
+      <w:r>
+        <w:rPr>
+          <w:rStyle w:val="VerbatimChar"/>
+        </w:rPr>
+        <w:t xml:space="preserve">  EVIDENCE --&gt;|Onesa AI disabled| LOCAL["Local grounded response"]</w:t>
+      </w:r>
+      <w:r>
+        <w:br/>
+      </w:r>
+      <w:r>
+        <w:rPr>
+          <w:rStyle w:val="VerbatimChar"/>
+        </w:rPr>
+        <w:t xml:space="preserve">  ONESA --&gt;|Success| ANSWER["Direct answer with steps, time, and sources"]</w:t>
+      </w:r>
+      <w:r>
+        <w:br/>
+      </w:r>
+      <w:r>
+        <w:rPr>
+          <w:rStyle w:val="VerbatimChar"/>
+        </w:rPr>
+        <w:t xml:space="preserve">  ONESA --&gt;|Unavailable| LOCAL</w:t>
       </w:r>
       <w:r>
         <w:br/>
@@ -781,7 +763,7 @@
         <w:t xml:space="preserve"> </w:t>
       </w:r>
       <w:r>
-        <w:t xml:space="preserve">(README files are excluded), adds a bounded snapshot from the dashboard database, and sends recent conversation context plus relevant evidence to Gemini first and Groq second when server API keys are configured. Keys remain on the server. Answers are formatted for readability and include ordered steps for how-to questions; the UI shows context capture time and source excerpts without provider/model labels or a provider data-transmission notice. With providers disabled or unavailable, a local grounded response remains available. The Assistant does not read environment files, README files, full AAS packages, private account records, or machine-control interfaces. See</w:t>
+        <w:t xml:space="preserve">(README files are excluded), adds a bounded snapshot from the dashboard database, and sends recent conversation context plus relevant evidence to Onesa AI when its server-side connection is configured. Onesa is built on the Llama architecture and trained in-house; credentials remain on the server. Answers are formatted for readability and include ordered steps for how-to questions; the UI shows context capture time and source excerpts. When Onesa AI is disabled or unavailable, a local grounded response remains available. The Assistant does not read environment files, README files, full AAS packages, private account records, or machine-control interfaces. See</w:t>
       </w:r>
       <w:r>
         <w:t xml:space="preserve"> </w:t>
@@ -914,7 +896,7 @@
         <w:t xml:space="preserve"> </w:t>
       </w:r>
       <w:r>
-        <w:t xml:space="preserve">sends the gateway a desired-state profile containing asset identity, protocol mappings, and telemetry rules; only the gateway’s matching application acknowledgement indicates that it applied the profile.</w:t>
+        <w:t xml:space="preserve">sends the gateway a desired-state profile containing asset identity, protocol mappings, and telemetry rules; only the gateway's matching application acknowledgement indicates that it applied the profile.</w:t>
       </w:r>
       <w:r>
         <w:t xml:space="preserve"> </w:t>
@@ -952,8 +934,7 @@
     <w:tbl>
       <w:tblPr>
         <w:tblStyle w:val="Table"/>
-        <w:tblW w:type="pct" w:w="5000"/>
-        <w:tblLayout w:type="fixed"/>
+        <w:tblW w:type="auto" w:w="0"/>
         <w:tblLook w:firstRow="1" w:lastRow="0" w:firstColumn="0" w:lastColumn="0" w:noHBand="0" w:noVBand="0" w:val="0020"/>
       </w:tblPr>
       <w:tblGrid>
@@ -1053,7 +1034,7 @@
               <w:pStyle w:val="Compact"/>
             </w:pPr>
             <w:r>
-              <w:t xml:space="preserve">Telemetry and bounded GPIO pulse requests route through the Pi; the dashboard does not currently expose its GPIO panel. A GPIO acknowledgement confirms a logic output only.</w:t>
+              <w:t xml:space="preserve">Telemetry and bounded GPIO18 pulse requests route through the Pi; operators and higher can use the dashboard's commissioned indicator control. A GPIO acknowledgement confirms a logic output only.</w:t>
             </w:r>
           </w:p>
         </w:tc>
@@ -1502,7 +1483,7 @@
         <w:pStyle w:val="BodyText"/>
       </w:pPr>
       <w:r>
-        <w:t xml:space="preserve">Alert writes atomically create the per-user inbox via the database trigger.</w:t>
+        <w:t xml:space="preserve">Alert writes atomically create the per-user inbox via the database trigger. Account creation queues a password-free welcome message without rolling back the new account if queueing is temporarily unavailable.</w:t>
       </w:r>
       <w:r>
         <w:t xml:space="preserve"> </w:t>
@@ -1547,7 +1528,7 @@
         <w:t xml:space="preserve"> </w:t>
       </w:r>
       <w:r>
-        <w:t xml:space="preserve">requires an engineer/admin owner and an eligible failed/unconfigured/unauthorized job. Reading a notification is independent of incident acknowledgment. The UI links notifications to event details by ID. NotificationService delivers the durable queue through the configured Resend sender and checks current account role and recipient domain at delivery time.</w:t>
+        <w:t xml:space="preserve">requires an engineer/admin owner and an eligible failed/unconfigured/unauthorized incident job. Reading a notification is independent of incident acknowledgment. The UI links incident notifications to event details by ID. NotificationService delivers the durable queue through the configured Amazon SES or Resend sender and checks current account role and recipient policy at delivery time.</w:t>
       </w:r>
     </w:p>
     <w:bookmarkEnd w:id="21"/>

</xml_diff>